<commit_message>
Update the content of the database design report
</commit_message>
<xml_diff>
--- a/proposed_database_design_report/database_design_report.docx
+++ b/proposed_database_design_report/database_design_report.docx
@@ -157,13 +157,23 @@
         </w:rPr>
         <w:t xml:space="preserve">Christiane </w:t>
       </w:r>
+      <w:proofErr w:type="spellStart"/>
       <w:r>
         <w:rPr>
           <w:rFonts w:ascii="Times New Roman" w:hAnsi="Times New Roman" w:cs="Times New Roman"/>
           <w:sz w:val="36"/>
           <w:szCs w:val="36"/>
         </w:rPr>
-        <w:t xml:space="preserve">Rhely Joselle A. </w:t>
+        <w:t>Rhely</w:t>
+      </w:r>
+      <w:proofErr w:type="spellEnd"/>
+      <w:r>
+        <w:rPr>
+          <w:rFonts w:ascii="Times New Roman" w:hAnsi="Times New Roman" w:cs="Times New Roman"/>
+          <w:sz w:val="36"/>
+          <w:szCs w:val="36"/>
+        </w:rPr>
+        <w:t xml:space="preserve"> Joselle A. </w:t>
       </w:r>
       <w:r>
         <w:rPr>
@@ -995,7 +1005,25 @@
           <w:sz w:val="24"/>
           <w:szCs w:val="24"/>
         </w:rPr>
-        <w:t>. By capturing this type of data, it can support the foundation of data analysis to used for reporting success indicators</w:t>
+        <w:t xml:space="preserve">. By capturing this type of data, it can support the foundation of data analysis to </w:t>
+      </w:r>
+      <w:proofErr w:type="spellStart"/>
+      <w:r>
+        <w:rPr>
+          <w:rFonts w:ascii="Times New Roman" w:hAnsi="Times New Roman" w:cs="Times New Roman"/>
+          <w:sz w:val="24"/>
+          <w:szCs w:val="24"/>
+        </w:rPr>
+        <w:t>used</w:t>
+      </w:r>
+      <w:proofErr w:type="spellEnd"/>
+      <w:r>
+        <w:rPr>
+          <w:rFonts w:ascii="Times New Roman" w:hAnsi="Times New Roman" w:cs="Times New Roman"/>
+          <w:sz w:val="24"/>
+          <w:szCs w:val="24"/>
+        </w:rPr>
+        <w:t xml:space="preserve"> for reporting success indicators</w:t>
       </w:r>
       <w:r>
         <w:rPr>
@@ -1053,6 +1081,7 @@
           <w:szCs w:val="24"/>
         </w:rPr>
       </w:pPr>
+      <w:proofErr w:type="spellStart"/>
       <w:r>
         <w:rPr>
           <w:rFonts w:ascii="Times New Roman" w:hAnsi="Times New Roman" w:cs="Times New Roman"/>
@@ -1061,6 +1090,7 @@
         </w:rPr>
         <w:t>fact_prices</w:t>
       </w:r>
+      <w:proofErr w:type="spellEnd"/>
     </w:p>
     <w:p>
       <w:pPr>
@@ -1075,6 +1105,7 @@
           <w:szCs w:val="24"/>
         </w:rPr>
       </w:pPr>
+      <w:proofErr w:type="spellStart"/>
       <w:r>
         <w:rPr>
           <w:rFonts w:ascii="Times New Roman" w:hAnsi="Times New Roman" w:cs="Times New Roman"/>
@@ -1083,6 +1114,7 @@
         </w:rPr>
         <w:t>fact_crime_reports</w:t>
       </w:r>
+      <w:proofErr w:type="spellEnd"/>
     </w:p>
     <w:p>
       <w:pPr>
@@ -1097,6 +1129,7 @@
           <w:szCs w:val="24"/>
         </w:rPr>
       </w:pPr>
+      <w:proofErr w:type="spellStart"/>
       <w:r>
         <w:rPr>
           <w:rFonts w:ascii="Times New Roman" w:hAnsi="Times New Roman" w:cs="Times New Roman"/>
@@ -1105,6 +1138,7 @@
         </w:rPr>
         <w:t>fact_accident_reports</w:t>
       </w:r>
+      <w:proofErr w:type="spellEnd"/>
     </w:p>
     <w:p>
       <w:pPr>
@@ -1119,6 +1153,7 @@
           <w:szCs w:val="24"/>
         </w:rPr>
       </w:pPr>
+      <w:proofErr w:type="spellStart"/>
       <w:r>
         <w:rPr>
           <w:rFonts w:ascii="Times New Roman" w:hAnsi="Times New Roman" w:cs="Times New Roman"/>
@@ -1127,6 +1162,7 @@
         </w:rPr>
         <w:t>fact_participation_rates</w:t>
       </w:r>
+      <w:proofErr w:type="spellEnd"/>
     </w:p>
     <w:p>
       <w:pPr>
@@ -1255,6 +1291,7 @@
           <w:szCs w:val="24"/>
         </w:rPr>
       </w:pPr>
+      <w:proofErr w:type="spellStart"/>
       <w:r>
         <w:rPr>
           <w:rFonts w:ascii="Times New Roman" w:hAnsi="Times New Roman" w:cs="Times New Roman"/>
@@ -1263,6 +1300,7 @@
         </w:rPr>
         <w:t>dim_dates</w:t>
       </w:r>
+      <w:proofErr w:type="spellEnd"/>
     </w:p>
     <w:p>
       <w:pPr>
@@ -1277,6 +1315,7 @@
           <w:szCs w:val="24"/>
         </w:rPr>
       </w:pPr>
+      <w:proofErr w:type="spellStart"/>
       <w:r>
         <w:rPr>
           <w:rFonts w:ascii="Times New Roman" w:hAnsi="Times New Roman" w:cs="Times New Roman"/>
@@ -1285,6 +1324,7 @@
         </w:rPr>
         <w:t>dim_times</w:t>
       </w:r>
+      <w:proofErr w:type="spellEnd"/>
     </w:p>
     <w:p>
       <w:pPr>
@@ -2308,6 +2348,7 @@
           <w:szCs w:val="24"/>
         </w:rPr>
       </w:pPr>
+      <w:proofErr w:type="spellStart"/>
       <w:r>
         <w:rPr>
           <w:rFonts w:ascii="Times New Roman" w:hAnsi="Times New Roman" w:cs="Times New Roman"/>
@@ -2316,6 +2357,7 @@
         </w:rPr>
         <w:t>fact_prices</w:t>
       </w:r>
+      <w:proofErr w:type="spellEnd"/>
     </w:p>
     <w:p>
       <w:pPr>
@@ -2330,6 +2372,7 @@
           <w:szCs w:val="24"/>
         </w:rPr>
       </w:pPr>
+      <w:proofErr w:type="spellStart"/>
       <w:r>
         <w:rPr>
           <w:rFonts w:ascii="Times New Roman" w:hAnsi="Times New Roman" w:cs="Times New Roman"/>
@@ -2338,6 +2381,7 @@
         </w:rPr>
         <w:t>dim_local_government_units</w:t>
       </w:r>
+      <w:proofErr w:type="spellEnd"/>
     </w:p>
     <w:p>
       <w:pPr>
@@ -2352,6 +2396,7 @@
           <w:szCs w:val="24"/>
         </w:rPr>
       </w:pPr>
+      <w:proofErr w:type="spellStart"/>
       <w:r>
         <w:rPr>
           <w:rFonts w:ascii="Times New Roman" w:hAnsi="Times New Roman" w:cs="Times New Roman"/>
@@ -2360,6 +2405,7 @@
         </w:rPr>
         <w:t>dim_agricultural_products</w:t>
       </w:r>
+      <w:proofErr w:type="spellEnd"/>
     </w:p>
     <w:p>
       <w:pPr>
@@ -2374,6 +2420,7 @@
           <w:szCs w:val="24"/>
         </w:rPr>
       </w:pPr>
+      <w:proofErr w:type="spellStart"/>
       <w:r>
         <w:rPr>
           <w:rFonts w:ascii="Times New Roman" w:hAnsi="Times New Roman" w:cs="Times New Roman"/>
@@ -2382,6 +2429,7 @@
         </w:rPr>
         <w:t>dim_price_comparison_periods</w:t>
       </w:r>
+      <w:proofErr w:type="spellEnd"/>
     </w:p>
     <w:p>
       <w:pPr>
@@ -2396,6 +2444,7 @@
           <w:szCs w:val="24"/>
         </w:rPr>
       </w:pPr>
+      <w:proofErr w:type="spellStart"/>
       <w:r>
         <w:rPr>
           <w:rFonts w:ascii="Times New Roman" w:hAnsi="Times New Roman" w:cs="Times New Roman"/>
@@ -2404,6 +2453,7 @@
         </w:rPr>
         <w:t>dim_dates</w:t>
       </w:r>
+      <w:proofErr w:type="spellEnd"/>
     </w:p>
     <w:p>
       <w:pPr>
@@ -2692,6 +2742,7 @@
           <w:szCs w:val="24"/>
         </w:rPr>
       </w:pPr>
+      <w:proofErr w:type="spellStart"/>
       <w:r>
         <w:rPr>
           <w:rFonts w:ascii="Times New Roman" w:hAnsi="Times New Roman" w:cs="Times New Roman"/>
@@ -2700,6 +2751,7 @@
         </w:rPr>
         <w:t>fact_crime_reports</w:t>
       </w:r>
+      <w:proofErr w:type="spellEnd"/>
     </w:p>
     <w:p>
       <w:pPr>
@@ -2714,6 +2766,7 @@
           <w:szCs w:val="24"/>
         </w:rPr>
       </w:pPr>
+      <w:proofErr w:type="spellStart"/>
       <w:r>
         <w:rPr>
           <w:rFonts w:ascii="Times New Roman" w:hAnsi="Times New Roman" w:cs="Times New Roman"/>
@@ -2722,6 +2775,7 @@
         </w:rPr>
         <w:t>dim_police_stations</w:t>
       </w:r>
+      <w:proofErr w:type="spellEnd"/>
     </w:p>
     <w:p>
       <w:pPr>
@@ -2736,6 +2790,7 @@
           <w:szCs w:val="24"/>
         </w:rPr>
       </w:pPr>
+      <w:proofErr w:type="spellStart"/>
       <w:r>
         <w:rPr>
           <w:rFonts w:ascii="Times New Roman" w:hAnsi="Times New Roman" w:cs="Times New Roman"/>
@@ -2744,6 +2799,7 @@
         </w:rPr>
         <w:t>dim_dates</w:t>
       </w:r>
+      <w:proofErr w:type="spellEnd"/>
     </w:p>
     <w:p>
       <w:pPr>
@@ -2758,6 +2814,7 @@
           <w:szCs w:val="24"/>
         </w:rPr>
       </w:pPr>
+      <w:proofErr w:type="spellStart"/>
       <w:r>
         <w:rPr>
           <w:rFonts w:ascii="Times New Roman" w:hAnsi="Times New Roman" w:cs="Times New Roman"/>
@@ -2766,6 +2823,7 @@
         </w:rPr>
         <w:t>dim_times</w:t>
       </w:r>
+      <w:proofErr w:type="spellEnd"/>
     </w:p>
     <w:p>
       <w:pPr>
@@ -3086,6 +3144,7 @@
                 <w:szCs w:val="24"/>
               </w:rPr>
             </w:pPr>
+            <w:proofErr w:type="spellStart"/>
             <w:r>
               <w:rPr>
                 <w:rFonts w:ascii="Times New Roman" w:hAnsi="Times New Roman" w:cs="Times New Roman"/>
@@ -3094,6 +3153,7 @@
               </w:rPr>
               <w:t>dim_dates</w:t>
             </w:r>
+            <w:proofErr w:type="spellEnd"/>
           </w:p>
         </w:tc>
       </w:tr>
@@ -3157,6 +3217,7 @@
                 <w:szCs w:val="24"/>
               </w:rPr>
             </w:pPr>
+            <w:proofErr w:type="spellStart"/>
             <w:r>
               <w:rPr>
                 <w:rFonts w:ascii="Times New Roman" w:hAnsi="Times New Roman" w:cs="Times New Roman"/>
@@ -3165,6 +3226,7 @@
               </w:rPr>
               <w:t>dim_times</w:t>
             </w:r>
+            <w:proofErr w:type="spellEnd"/>
           </w:p>
         </w:tc>
       </w:tr>
@@ -3302,6 +3364,7 @@
                 <w:szCs w:val="24"/>
               </w:rPr>
             </w:pPr>
+            <w:proofErr w:type="spellStart"/>
             <w:r>
               <w:rPr>
                 <w:rFonts w:ascii="Times New Roman" w:hAnsi="Times New Roman" w:cs="Times New Roman"/>
@@ -3310,6 +3373,7 @@
               </w:rPr>
               <w:t>fact_prices</w:t>
             </w:r>
+            <w:proofErr w:type="spellEnd"/>
           </w:p>
         </w:tc>
       </w:tr>
@@ -3460,7 +3524,7 @@
             <w:sz w:val="24"/>
             <w:szCs w:val="24"/>
           </w:rPr>
-          <w:t>Full ER</w:t>
+          <w:t>Full ERD I</w:t>
         </w:r>
         <w:r>
           <w:rPr>
@@ -3469,7 +3533,7 @@
             <w:sz w:val="24"/>
             <w:szCs w:val="24"/>
           </w:rPr>
-          <w:t>D</w:t>
+          <w:t>m</w:t>
         </w:r>
         <w:r>
           <w:rPr>
@@ -3478,7 +3542,7 @@
             <w:sz w:val="24"/>
             <w:szCs w:val="24"/>
           </w:rPr>
-          <w:t xml:space="preserve"> Image</w:t>
+          <w:t>age</w:t>
         </w:r>
       </w:hyperlink>
     </w:p>
@@ -3507,14 +3571,6 @@
           <w:szCs w:val="24"/>
         </w:rPr>
         <w:t xml:space="preserve">Interactive Entity Relationship Diagram: </w:t>
-      </w:r>
-      <w:r>
-        <w:rPr>
-          <w:rFonts w:ascii="Times New Roman" w:hAnsi="Times New Roman" w:cs="Times New Roman"/>
-          <w:sz w:val="24"/>
-          <w:szCs w:val="24"/>
-        </w:rPr>
-        <w:t xml:space="preserve">Explore tables, attributes, relationships at </w:t>
       </w:r>
       <w:hyperlink r:id="rId11" w:history="1">
         <w:r>
@@ -3524,7 +3580,25 @@
             <w:sz w:val="24"/>
             <w:szCs w:val="24"/>
           </w:rPr>
-          <w:t>dbdiagram.io</w:t>
+          <w:t>Full Interacti</w:t>
+        </w:r>
+        <w:r>
+          <w:rPr>
+            <w:rStyle w:val="Hyperlink"/>
+            <w:rFonts w:ascii="Times New Roman" w:hAnsi="Times New Roman" w:cs="Times New Roman"/>
+            <w:sz w:val="24"/>
+            <w:szCs w:val="24"/>
+          </w:rPr>
+          <w:t>v</w:t>
+        </w:r>
+        <w:r>
+          <w:rPr>
+            <w:rStyle w:val="Hyperlink"/>
+            <w:rFonts w:ascii="Times New Roman" w:hAnsi="Times New Roman" w:cs="Times New Roman"/>
+            <w:sz w:val="24"/>
+            <w:szCs w:val="24"/>
+          </w:rPr>
+          <w:t>e ERD</w:t>
         </w:r>
       </w:hyperlink>
     </w:p>
@@ -3552,15 +3626,15 @@
           <w:sz w:val="24"/>
           <w:szCs w:val="24"/>
         </w:rPr>
-        <w:t xml:space="preserve">GitHub Repository: </w:t>
-      </w:r>
-      <w:r>
-        <w:rPr>
-          <w:rFonts w:ascii="Times New Roman" w:hAnsi="Times New Roman" w:cs="Times New Roman"/>
-          <w:sz w:val="24"/>
-          <w:szCs w:val="24"/>
-        </w:rPr>
-        <w:t xml:space="preserve">Full DBML schema, checklists, and supporting documentation: </w:t>
+        <w:t>GitHub Repository:</w:t>
+      </w:r>
+      <w:r>
+        <w:rPr>
+          <w:rFonts w:ascii="Times New Roman" w:hAnsi="Times New Roman" w:cs="Times New Roman"/>
+          <w:sz w:val="24"/>
+          <w:szCs w:val="24"/>
+        </w:rPr>
+        <w:t xml:space="preserve"> </w:t>
       </w:r>
       <w:hyperlink r:id="rId12" w:history="1">
         <w:r>
@@ -3570,7 +3644,25 @@
             <w:sz w:val="24"/>
             <w:szCs w:val="24"/>
           </w:rPr>
-          <w:t>Data Bank System</w:t>
+          <w:t>Data Bank</w:t>
+        </w:r>
+        <w:r>
+          <w:rPr>
+            <w:rStyle w:val="Hyperlink"/>
+            <w:rFonts w:ascii="Times New Roman" w:hAnsi="Times New Roman" w:cs="Times New Roman"/>
+            <w:sz w:val="24"/>
+            <w:szCs w:val="24"/>
+          </w:rPr>
+          <w:t xml:space="preserve"> </w:t>
+        </w:r>
+        <w:r>
+          <w:rPr>
+            <w:rStyle w:val="Hyperlink"/>
+            <w:rFonts w:ascii="Times New Roman" w:hAnsi="Times New Roman" w:cs="Times New Roman"/>
+            <w:sz w:val="24"/>
+            <w:szCs w:val="24"/>
+          </w:rPr>
+          <w:t>System</w:t>
         </w:r>
       </w:hyperlink>
     </w:p>
@@ -4111,47 +4203,47 @@
           <w:sz w:val="24"/>
           <w:szCs w:val="24"/>
         </w:rPr>
+        <w:t xml:space="preserve">Development of a website to create a </w:t>
+      </w:r>
+      <w:r>
+        <w:rPr>
+          <w:rFonts w:ascii="Times New Roman" w:hAnsi="Times New Roman" w:cs="Times New Roman"/>
+          <w:b/>
+          <w:bCs/>
+          <w:sz w:val="24"/>
+          <w:szCs w:val="24"/>
+        </w:rPr>
+        <w:t>unified interface</w:t>
+      </w:r>
+      <w:r>
+        <w:rPr>
+          <w:rFonts w:ascii="Times New Roman" w:hAnsi="Times New Roman" w:cs="Times New Roman"/>
+          <w:sz w:val="24"/>
+          <w:szCs w:val="24"/>
+        </w:rPr>
+        <w:t xml:space="preserve"> for government employees to access data from different sources.</w:t>
+      </w:r>
+    </w:p>
+    <w:p>
+      <w:pPr>
+        <w:pStyle w:val="ListParagraph"/>
+        <w:spacing w:after="0" w:line="360" w:lineRule="auto"/>
+        <w:ind w:left="0"/>
+        <w:rPr>
+          <w:rFonts w:ascii="Times New Roman" w:hAnsi="Times New Roman" w:cs="Times New Roman"/>
+          <w:b/>
+          <w:bCs/>
+          <w:sz w:val="24"/>
+          <w:szCs w:val="24"/>
+        </w:rPr>
+      </w:pPr>
+      <w:r>
+        <w:rPr>
+          <w:rFonts w:ascii="Times New Roman" w:hAnsi="Times New Roman" w:cs="Times New Roman"/>
+          <w:sz w:val="24"/>
+          <w:szCs w:val="24"/>
+        </w:rPr>
         <w:lastRenderedPageBreak/>
-        <w:t xml:space="preserve">Development of a website to create a </w:t>
-      </w:r>
-      <w:r>
-        <w:rPr>
-          <w:rFonts w:ascii="Times New Roman" w:hAnsi="Times New Roman" w:cs="Times New Roman"/>
-          <w:b/>
-          <w:bCs/>
-          <w:sz w:val="24"/>
-          <w:szCs w:val="24"/>
-        </w:rPr>
-        <w:t>unified interface</w:t>
-      </w:r>
-      <w:r>
-        <w:rPr>
-          <w:rFonts w:ascii="Times New Roman" w:hAnsi="Times New Roman" w:cs="Times New Roman"/>
-          <w:sz w:val="24"/>
-          <w:szCs w:val="24"/>
-        </w:rPr>
-        <w:t xml:space="preserve"> for government employees to access data from different sources.</w:t>
-      </w:r>
-    </w:p>
-    <w:p>
-      <w:pPr>
-        <w:pStyle w:val="ListParagraph"/>
-        <w:spacing w:after="0" w:line="360" w:lineRule="auto"/>
-        <w:ind w:left="0"/>
-        <w:rPr>
-          <w:rFonts w:ascii="Times New Roman" w:hAnsi="Times New Roman" w:cs="Times New Roman"/>
-          <w:b/>
-          <w:bCs/>
-          <w:sz w:val="24"/>
-          <w:szCs w:val="24"/>
-        </w:rPr>
-      </w:pPr>
-      <w:r>
-        <w:rPr>
-          <w:rFonts w:ascii="Times New Roman" w:hAnsi="Times New Roman" w:cs="Times New Roman"/>
-          <w:sz w:val="24"/>
-          <w:szCs w:val="24"/>
-        </w:rPr>
         <w:t>These</w:t>
       </w:r>
       <w:r>

</xml_diff>

<commit_message>
Update the content of the report
- Fix the hyperlinks
</commit_message>
<xml_diff>
--- a/proposed_database_design_report/database_design_report.docx
+++ b/proposed_database_design_report/database_design_report.docx
@@ -3524,25 +3524,7 @@
             <w:sz w:val="24"/>
             <w:szCs w:val="24"/>
           </w:rPr>
-          <w:t>Full ERD I</w:t>
-        </w:r>
-        <w:r>
-          <w:rPr>
-            <w:rStyle w:val="Hyperlink"/>
-            <w:rFonts w:ascii="Times New Roman" w:hAnsi="Times New Roman" w:cs="Times New Roman"/>
-            <w:sz w:val="24"/>
-            <w:szCs w:val="24"/>
-          </w:rPr>
-          <w:t>m</w:t>
-        </w:r>
-        <w:r>
-          <w:rPr>
-            <w:rStyle w:val="Hyperlink"/>
-            <w:rFonts w:ascii="Times New Roman" w:hAnsi="Times New Roman" w:cs="Times New Roman"/>
-            <w:sz w:val="24"/>
-            <w:szCs w:val="24"/>
-          </w:rPr>
-          <w:t>age</w:t>
+          <w:t>Click here</w:t>
         </w:r>
       </w:hyperlink>
     </w:p>
@@ -3580,25 +3562,7 @@
             <w:sz w:val="24"/>
             <w:szCs w:val="24"/>
           </w:rPr>
-          <w:t>Full Interacti</w:t>
-        </w:r>
-        <w:r>
-          <w:rPr>
-            <w:rStyle w:val="Hyperlink"/>
-            <w:rFonts w:ascii="Times New Roman" w:hAnsi="Times New Roman" w:cs="Times New Roman"/>
-            <w:sz w:val="24"/>
-            <w:szCs w:val="24"/>
-          </w:rPr>
-          <w:t>v</w:t>
-        </w:r>
-        <w:r>
-          <w:rPr>
-            <w:rStyle w:val="Hyperlink"/>
-            <w:rFonts w:ascii="Times New Roman" w:hAnsi="Times New Roman" w:cs="Times New Roman"/>
-            <w:sz w:val="24"/>
-            <w:szCs w:val="24"/>
-          </w:rPr>
-          <w:t>e ERD</w:t>
+          <w:t>Click here</w:t>
         </w:r>
       </w:hyperlink>
     </w:p>
@@ -3626,7 +3590,27 @@
           <w:sz w:val="24"/>
           <w:szCs w:val="24"/>
         </w:rPr>
-        <w:t>GitHub Repository:</w:t>
+        <w:t>Git</w:t>
+      </w:r>
+      <w:r>
+        <w:rPr>
+          <w:rFonts w:ascii="Times New Roman" w:hAnsi="Times New Roman" w:cs="Times New Roman"/>
+          <w:b/>
+          <w:bCs/>
+          <w:sz w:val="24"/>
+          <w:szCs w:val="24"/>
+        </w:rPr>
+        <w:t>h</w:t>
+      </w:r>
+      <w:r>
+        <w:rPr>
+          <w:rFonts w:ascii="Times New Roman" w:hAnsi="Times New Roman" w:cs="Times New Roman"/>
+          <w:b/>
+          <w:bCs/>
+          <w:sz w:val="24"/>
+          <w:szCs w:val="24"/>
+        </w:rPr>
+        <w:t>ub Repository:</w:t>
       </w:r>
       <w:r>
         <w:rPr>
@@ -3644,25 +3628,7 @@
             <w:sz w:val="24"/>
             <w:szCs w:val="24"/>
           </w:rPr>
-          <w:t>Data Bank</w:t>
-        </w:r>
-        <w:r>
-          <w:rPr>
-            <w:rStyle w:val="Hyperlink"/>
-            <w:rFonts w:ascii="Times New Roman" w:hAnsi="Times New Roman" w:cs="Times New Roman"/>
-            <w:sz w:val="24"/>
-            <w:szCs w:val="24"/>
-          </w:rPr>
-          <w:t xml:space="preserve"> </w:t>
-        </w:r>
-        <w:r>
-          <w:rPr>
-            <w:rStyle w:val="Hyperlink"/>
-            <w:rFonts w:ascii="Times New Roman" w:hAnsi="Times New Roman" w:cs="Times New Roman"/>
-            <w:sz w:val="24"/>
-            <w:szCs w:val="24"/>
-          </w:rPr>
-          <w:t>System</w:t>
+          <w:t>Click here</w:t>
         </w:r>
       </w:hyperlink>
     </w:p>

</xml_diff>